<commit_message>
Submission report created via GitHub Action
</commit_message>
<xml_diff>
--- a/submission-report.docx
+++ b/submission-report.docx
@@ -19,7 +19,7 @@
         </w:numPr>
       </w:pPr>
       <w:r>
-        <w:t xml:space="preserve">Submission generated at 09/12/2026 at 18:31:24</w:t>
+        <w:t xml:space="preserve">Submission generated at 09/12/2026 at 18:46:25</w:t>
       </w:r>
     </w:p>
     <w:p>
@@ -304,14 +304,58 @@
         <w:t xml:space="preserve"> </w:t>
       </w:r>
       <w:r>
-        <w:t xml:space="preserve">to make sure my functions are testable. Mocking and stubbing in Unity was not very easy for me and this was one of the part where AI helped a lot. It helped me to create a mock socket and how to define it.</w:t>
-      </w:r>
-    </w:p>
-    <w:p>
-      <w:r>
-        <w:pict>
-          <v:rect style="width:0;height:1.5pt" o:hralign="center" o:hrstd="t" o:hr="t"/>
-        </w:pict>
+        <w:t xml:space="preserve">to make sure my functions are testable. Mocking and stubbing in Unity was not very easy for me and this was one of the part where AI helped a lot. It helped me to create a mock socket and how to define it. I was trying to run</w:t>
+      </w:r>
+      <w:r>
+        <w:t xml:space="preserve"> </w:t>
+      </w:r>
+      <w:r>
+        <w:rPr>
+          <w:rStyle w:val="VerbatimChar"/>
+        </w:rPr>
+        <w:t xml:space="preserve">make report</w:t>
+      </w:r>
+      <w:r>
+        <w:t xml:space="preserve"> </w:t>
+      </w:r>
+      <w:r>
+        <w:t xml:space="preserve">and encountered the following error</w:t>
+      </w:r>
+      <w:r>
+        <w:t xml:space="preserve"> </w:t>
+      </w:r>
+      <w:r>
+        <w:rPr>
+          <w:rStyle w:val="VerbatimChar"/>
+        </w:rPr>
+        <w:t xml:space="preserve">gcovr -r . --html --html-details --exclude-directories build/tests/harness --exclude '.*main\.c$' --exclude '.*test\.c$' -o ./build/report/html/coverage_report.html /bin/bash: line 1: gcovr: command not found</w:t>
+      </w:r>
+      <w:r>
+        <w:t xml:space="preserve"> </w:t>
+      </w:r>
+      <w:r>
+        <w:t xml:space="preserve">I tried to sudo install it but it requires admin access so I install</w:t>
+      </w:r>
+      <w:r>
+        <w:t xml:space="preserve"> </w:t>
+      </w:r>
+      <w:r>
+        <w:rPr>
+          <w:rStyle w:val="VerbatimChar"/>
+        </w:rPr>
+        <w:t xml:space="preserve">gcovr</w:t>
+      </w:r>
+      <w:r>
+        <w:t xml:space="preserve"> </w:t>
+      </w:r>
+      <w:r>
+        <w:t xml:space="preserve">on my machine and ran the report.</w:t>
+      </w:r>
+      <w:r>
+        <w:t xml:space="preserve"> </w:t>
+      </w:r>
+      <w:r>
+        <w:t xml:space="preserve">—</w:t>
       </w:r>
     </w:p>
     <w:bookmarkEnd w:id="30"/>
@@ -19886,7 +19930,7 @@
         <w:rPr>
           <w:rStyle w:val="DecValTok"/>
         </w:rPr>
-        <w:t xml:space="preserve">1</w:t>
+        <w:t xml:space="preserve">0</w:t>
       </w:r>
       <w:r>
         <w:rPr>
@@ -20231,7 +20275,7 @@
         <w:rPr>
           <w:rStyle w:val="DecValTok"/>
         </w:rPr>
-        <w:t xml:space="preserve">1</w:t>
+        <w:t xml:space="preserve">0</w:t>
       </w:r>
       <w:r>
         <w:rPr>
@@ -45334,7 +45378,7 @@
         <w:pStyle w:val="FirstParagraph"/>
       </w:pPr>
       <w:r>
-        <w:t xml:space="preserve">Report generated on 09/12/2026 at 18:31:26</w:t>
+        <w:t xml:space="preserve">Report generated on 09/12/2026 at 18:46:26</w:t>
       </w:r>
     </w:p>
     <w:p>
@@ -45359,7 +45403,7 @@
         <w:pStyle w:val="FirstParagraph"/>
       </w:pPr>
       <w:r>
-        <w:t xml:space="preserve">SHA-256 Hash of the report: 0b4f605d19a01e95df811a74d5c174eb4e0e860b505743f9f9c2a1b6bcbcbd0f</w:t>
+        <w:t xml:space="preserve">SHA-256 Hash of the report: 752ce99346a0607827112d178376b7eccfad5ef56eff00c1a9c51be3f1edbd96</w:t>
       </w:r>
     </w:p>
     <w:p>

</xml_diff>